<commit_message>
Correção atividade 04-09-2025(Linguagem compilada e Linguagem interpretada)
</commit_message>
<xml_diff>
--- a/Atividade 26 -08-2025 Escopo de projeto - Antonio Jair.docx
+++ b/Atividade 26 -08-2025 Escopo de projeto - Antonio Jair.docx
@@ -190,7 +190,13 @@
               <w:rPr>
                 <w:rFonts w:asciiTheme="minorHAnsi" w:hAnsiTheme="minorHAnsi"/>
               </w:rPr>
-              <w:t>26</w:t>
+              <w:t>2</w:t>
+            </w:r>
+            <w:r>
+              <w:rPr>
+                <w:rFonts w:asciiTheme="minorHAnsi" w:hAnsiTheme="minorHAnsi"/>
+              </w:rPr>
+              <w:t>8</w:t>
             </w:r>
             <w:r>
               <w:rPr>
@@ -214,7 +220,7 @@
               <w:rPr>
                 <w:rFonts w:asciiTheme="minorHAnsi" w:hAnsiTheme="minorHAnsi"/>
               </w:rPr>
-              <w:t>4</w:t>
+              <w:t>5</w:t>
             </w:r>
           </w:p>
         </w:tc>
@@ -666,7 +672,8 @@
     </w:p>
     <w:p>
       <w:pPr>
-        <w:jc w:val="center"/>
+        <w:ind w:firstLine="708"/>
+        <w:jc w:val="both"/>
         <w:rPr>
           <w:bCs/>
           <w:sz w:val="24"/>
@@ -677,18 +684,47 @@
           <w:bCs/>
           <w:sz w:val="24"/>
         </w:rPr>
-        <w:t>Monitoramento da movimentação do feltro e envio de dados para o banco de dados através do Node-Red. Análise de dados para identificação de padrões que podem representar desperdícios ou problemas no processo</w:t>
+        <w:t>Monitoramento da movimentação do feltro</w:t>
       </w:r>
       <w:r>
         <w:rPr>
           <w:bCs/>
           <w:sz w:val="24"/>
         </w:rPr>
+        <w:t xml:space="preserve"> no processo de transferência de imagem em calandra rotativa,</w:t>
+      </w:r>
+      <w:r>
+        <w:rPr>
+          <w:bCs/>
+          <w:sz w:val="24"/>
+        </w:rPr>
+        <w:t xml:space="preserve"> e </w:t>
+      </w:r>
+      <w:r>
+        <w:rPr>
+          <w:bCs/>
+          <w:sz w:val="24"/>
+        </w:rPr>
+        <w:t>coleta e envio de informações precisas</w:t>
+      </w:r>
+      <w:r>
+        <w:rPr>
+          <w:bCs/>
+          <w:sz w:val="24"/>
+        </w:rPr>
+        <w:t xml:space="preserve"> para o banco de dados através do Node-Red. Análise de dados para identificação de padrões que podem representar desperdícios ou problemas no processo</w:t>
+      </w:r>
+      <w:r>
+        <w:rPr>
+          <w:bCs/>
+          <w:sz w:val="24"/>
+        </w:rPr>
         <w:t xml:space="preserve"> de produção.</w:t>
       </w:r>
     </w:p>
     <w:p>
       <w:pPr>
+        <w:jc w:val="both"/>
         <w:rPr>
           <w:b/>
           <w:sz w:val="24"/>
@@ -1081,41 +1117,7 @@
             <w:noProof/>
             <w:webHidden/>
           </w:rPr>
-          <w:fldChar w:fldCharType="begin"/>
-        </w:r>
-        <w:r>
-          <w:rPr>
-            <w:noProof/>
-            <w:webHidden/>
-          </w:rPr>
-          <w:instrText xml:space="preserve"> PAGEREF _Toc202862253 \h </w:instrText>
-        </w:r>
-        <w:r>
-          <w:rPr>
-            <w:noProof/>
-            <w:webHidden/>
-          </w:rPr>
-        </w:r>
-        <w:r>
-          <w:rPr>
-            <w:noProof/>
-            <w:webHidden/>
-          </w:rPr>
-          <w:fldChar w:fldCharType="separate"/>
-        </w:r>
-        <w:r>
-          <w:rPr>
-            <w:noProof/>
-            <w:webHidden/>
-          </w:rPr>
-          <w:t>2</w:t>
-        </w:r>
-        <w:r>
-          <w:rPr>
-            <w:noProof/>
-            <w:webHidden/>
-          </w:rPr>
-          <w:fldChar w:fldCharType="end"/>
+          <w:t>4</w:t>
         </w:r>
       </w:hyperlink>
     </w:p>
@@ -1163,41 +1165,7 @@
             <w:noProof/>
             <w:webHidden/>
           </w:rPr>
-          <w:fldChar w:fldCharType="begin"/>
-        </w:r>
-        <w:r>
-          <w:rPr>
-            <w:noProof/>
-            <w:webHidden/>
-          </w:rPr>
-          <w:instrText xml:space="preserve"> PAGEREF _Toc202862254 \h </w:instrText>
-        </w:r>
-        <w:r>
-          <w:rPr>
-            <w:noProof/>
-            <w:webHidden/>
-          </w:rPr>
-        </w:r>
-        <w:r>
-          <w:rPr>
-            <w:noProof/>
-            <w:webHidden/>
-          </w:rPr>
-          <w:fldChar w:fldCharType="separate"/>
-        </w:r>
-        <w:r>
-          <w:rPr>
-            <w:noProof/>
-            <w:webHidden/>
-          </w:rPr>
-          <w:t>2</w:t>
-        </w:r>
-        <w:r>
-          <w:rPr>
-            <w:noProof/>
-            <w:webHidden/>
-          </w:rPr>
-          <w:fldChar w:fldCharType="end"/>
+          <w:t>4</w:t>
         </w:r>
       </w:hyperlink>
     </w:p>
@@ -1243,41 +1211,7 @@
             <w:noProof/>
             <w:webHidden/>
           </w:rPr>
-          <w:fldChar w:fldCharType="begin"/>
-        </w:r>
-        <w:r>
-          <w:rPr>
-            <w:noProof/>
-            <w:webHidden/>
-          </w:rPr>
-          <w:instrText xml:space="preserve"> PAGEREF _Toc202862261 \h </w:instrText>
-        </w:r>
-        <w:r>
-          <w:rPr>
-            <w:noProof/>
-            <w:webHidden/>
-          </w:rPr>
-        </w:r>
-        <w:r>
-          <w:rPr>
-            <w:noProof/>
-            <w:webHidden/>
-          </w:rPr>
-          <w:fldChar w:fldCharType="separate"/>
-        </w:r>
-        <w:r>
-          <w:rPr>
-            <w:noProof/>
-            <w:webHidden/>
-          </w:rPr>
-          <w:t>3</w:t>
-        </w:r>
-        <w:r>
-          <w:rPr>
-            <w:noProof/>
-            <w:webHidden/>
-          </w:rPr>
-          <w:fldChar w:fldCharType="end"/>
+          <w:t>4</w:t>
         </w:r>
       </w:hyperlink>
     </w:p>
@@ -1329,47 +1263,16 @@
             <w:noProof/>
             <w:webHidden/>
           </w:rPr>
-          <w:fldChar w:fldCharType="begin"/>
-        </w:r>
-        <w:r>
-          <w:rPr>
-            <w:noProof/>
-            <w:webHidden/>
-          </w:rPr>
-          <w:instrText xml:space="preserve"> PAGEREF _Toc202862260 \h </w:instrText>
-        </w:r>
-        <w:r>
-          <w:rPr>
-            <w:noProof/>
-            <w:webHidden/>
-          </w:rPr>
-        </w:r>
-        <w:r>
-          <w:rPr>
-            <w:noProof/>
-            <w:webHidden/>
-          </w:rPr>
-          <w:fldChar w:fldCharType="separate"/>
-        </w:r>
-        <w:r>
-          <w:rPr>
-            <w:noProof/>
-            <w:webHidden/>
-          </w:rPr>
-          <w:t>3</w:t>
-        </w:r>
-        <w:r>
-          <w:rPr>
-            <w:noProof/>
-            <w:webHidden/>
-          </w:rPr>
-          <w:fldChar w:fldCharType="end"/>
+          <w:t>4</w:t>
         </w:r>
       </w:hyperlink>
     </w:p>
     <w:p>
       <w:pPr>
         <w:pStyle w:val="Sumrio1"/>
+        <w:rPr>
+          <w:noProof/>
+        </w:rPr>
       </w:pPr>
       <w:hyperlink w:anchor="_Toc202862261" w:history="1">
         <w:r>
@@ -1394,7 +1297,7 @@
             <w:rStyle w:val="Hyperlink"/>
             <w:noProof/>
           </w:rPr>
-          <w:t>Aprovações</w:t>
+          <w:t>Tecnologias e equipamentos</w:t>
         </w:r>
         <w:r>
           <w:rPr>
@@ -1408,44 +1311,16 @@
             <w:noProof/>
             <w:webHidden/>
           </w:rPr>
-          <w:fldChar w:fldCharType="begin"/>
-        </w:r>
-        <w:r>
-          <w:rPr>
-            <w:noProof/>
-            <w:webHidden/>
-          </w:rPr>
-          <w:instrText xml:space="preserve"> PAGEREF _Toc202862261 \h </w:instrText>
-        </w:r>
-        <w:r>
-          <w:rPr>
-            <w:noProof/>
-            <w:webHidden/>
-          </w:rPr>
-        </w:r>
-        <w:r>
-          <w:rPr>
-            <w:noProof/>
-            <w:webHidden/>
-          </w:rPr>
-          <w:fldChar w:fldCharType="separate"/>
-        </w:r>
-        <w:r>
-          <w:rPr>
-            <w:noProof/>
-            <w:webHidden/>
-          </w:rPr>
-          <w:t>3</w:t>
-        </w:r>
-        <w:r>
-          <w:rPr>
-            <w:noProof/>
-            <w:webHidden/>
-          </w:rPr>
-          <w:fldChar w:fldCharType="end"/>
+          <w:t>5</w:t>
         </w:r>
       </w:hyperlink>
     </w:p>
+    <w:p>
+      <w:r>
+        <w:t>6.      Parte interessadas............................................................................................................................... 6</w:t>
+      </w:r>
+    </w:p>
+    <w:p/>
     <w:p>
       <w:pPr>
         <w:pStyle w:val="Sumrio1"/>
@@ -1633,11 +1508,29 @@
     </w:p>
     <w:p>
       <w:pPr>
-        <w:ind w:firstLine="284"/>
+        <w:ind w:firstLine="708"/>
         <w:jc w:val="both"/>
       </w:pPr>
       <w:r>
-        <w:t>No processo de transferência de imagem o feltro pode se aproximar das extremidades, o que pode provocar danos no equipamento, atrasos no processo de produção. Por tanto, é interessante monitorar os padrões de aproximação do feltro nas extremidades e relacionar com possíveis problemas na máquina e oportunidades de otimização.</w:t>
+        <w:t xml:space="preserve">No processo de transferência de imagem o feltro pode se </w:t>
+      </w:r>
+      <w:r>
+        <w:t>movimentar até</w:t>
+      </w:r>
+      <w:r>
+        <w:t xml:space="preserve"> das extremidades, o que pode provocar danos no equipamento, </w:t>
+      </w:r>
+      <w:r>
+        <w:t>paradas</w:t>
+      </w:r>
+      <w:r>
+        <w:t xml:space="preserve"> no processo de produção</w:t>
+      </w:r>
+      <w:r>
+        <w:t xml:space="preserve"> e até provocar acidentes, caso não seja detectado o problema.</w:t>
+      </w:r>
+      <w:r>
+        <w:t xml:space="preserve"> Por tanto, é interessante monitorar os padrões de aproximação do feltro nas extremidades e relacionar com possíveis problemas na máquina e oportunidades de otimização.</w:t>
       </w:r>
     </w:p>
     <w:p>
@@ -1671,19 +1564,156 @@
     <w:p>
       <w:pPr>
         <w:pStyle w:val="EstiloTtulo1TimesNewRoman"/>
-        <w:rPr>
-          <w:rFonts w:asciiTheme="minorHAnsi" w:hAnsiTheme="minorHAnsi"/>
+        <w:jc w:val="both"/>
+      </w:pPr>
+      <w:r>
+        <w:t xml:space="preserve"> </w:t>
+      </w:r>
+      <w:r>
+        <w:t xml:space="preserve"> </w:t>
+      </w:r>
+      <w:r>
+        <w:tab/>
+      </w:r>
+      <w:r>
+        <w:rPr>
           <w:b w:val="0"/>
           <w:bCs w:val="0"/>
         </w:rPr>
-      </w:pPr>
+        <w:t xml:space="preserve">O </w:t>
+      </w:r>
       <w:r>
         <w:rPr>
-          <w:rFonts w:asciiTheme="minorHAnsi" w:hAnsiTheme="minorHAnsi"/>
           <w:b w:val="0"/>
           <w:bCs w:val="0"/>
         </w:rPr>
-        <w:t>O monitoramento feito através do sistema automatizado traria maior segurança, otimização de uso, e menor custo com manutenção preventiva.</w:t>
+        <w:t>sistema automatizado detecta</w:t>
+      </w:r>
+      <w:r>
+        <w:rPr>
+          <w:b w:val="0"/>
+          <w:bCs w:val="0"/>
+        </w:rPr>
+        <w:t xml:space="preserve"> os</w:t>
+      </w:r>
+      <w:r>
+        <w:rPr>
+          <w:b w:val="0"/>
+          <w:bCs w:val="0"/>
+        </w:rPr>
+        <w:t xml:space="preserve"> problema e falhas em tempo real, alertando a equipe antes que ocorram acidentes. Isso minimiza os riscos para os operadores e para o próprio equipamento</w:t>
+      </w:r>
+      <w:r>
+        <w:rPr>
+          <w:b w:val="0"/>
+          <w:bCs w:val="0"/>
+        </w:rPr>
+        <w:t xml:space="preserve"> </w:t>
+      </w:r>
+      <w:r>
+        <w:rPr>
+          <w:b w:val="0"/>
+          <w:bCs w:val="0"/>
+        </w:rPr>
+        <w:t>fornece</w:t>
+      </w:r>
+      <w:r>
+        <w:rPr>
+          <w:b w:val="0"/>
+          <w:bCs w:val="0"/>
+        </w:rPr>
+        <w:t>ndo</w:t>
+      </w:r>
+      <w:r>
+        <w:rPr>
+          <w:b w:val="0"/>
+          <w:bCs w:val="0"/>
+        </w:rPr>
+        <w:t xml:space="preserve"> dados precisos sobre o desempenho da máquina, </w:t>
+      </w:r>
+      <w:r>
+        <w:rPr>
+          <w:b w:val="0"/>
+          <w:bCs w:val="0"/>
+        </w:rPr>
+        <w:t>e</w:t>
+      </w:r>
+      <w:r>
+        <w:rPr>
+          <w:b w:val="0"/>
+          <w:bCs w:val="0"/>
+        </w:rPr>
+        <w:t xml:space="preserve"> permit</w:t>
+      </w:r>
+      <w:r>
+        <w:rPr>
+          <w:b w:val="0"/>
+          <w:bCs w:val="0"/>
+        </w:rPr>
+        <w:t>indo</w:t>
+      </w:r>
+      <w:r>
+        <w:rPr>
+          <w:b w:val="0"/>
+          <w:bCs w:val="0"/>
+        </w:rPr>
+        <w:t xml:space="preserve"> que você ajuste a operação para atingir a máxima eficiência. </w:t>
+      </w:r>
+      <w:r>
+        <w:rPr>
+          <w:b w:val="0"/>
+          <w:bCs w:val="0"/>
+        </w:rPr>
+        <w:t>C</w:t>
+      </w:r>
+      <w:r>
+        <w:rPr>
+          <w:b w:val="0"/>
+          <w:bCs w:val="0"/>
+        </w:rPr>
+        <w:t>om o monitoramento contínuo</w:t>
+      </w:r>
+      <w:r>
+        <w:rPr>
+          <w:b w:val="0"/>
+          <w:bCs w:val="0"/>
+        </w:rPr>
+        <w:t>, a</w:t>
+      </w:r>
+      <w:r>
+        <w:rPr>
+          <w:b w:val="0"/>
+          <w:bCs w:val="0"/>
+        </w:rPr>
+        <w:t xml:space="preserve"> manutenção é realizada apenas quando necessária (manutenção preditiva), evitando gastos com consertos de emergência e com a substituição desnecessária d</w:t>
+      </w:r>
+      <w:r>
+        <w:rPr>
+          <w:b w:val="0"/>
+          <w:bCs w:val="0"/>
+        </w:rPr>
+        <w:t>o</w:t>
+      </w:r>
+      <w:r>
+        <w:rPr>
+          <w:b w:val="0"/>
+          <w:bCs w:val="0"/>
+        </w:rPr>
+        <w:t xml:space="preserve"> </w:t>
+      </w:r>
+      <w:r>
+        <w:rPr>
+          <w:b w:val="0"/>
+          <w:bCs w:val="0"/>
+        </w:rPr>
+        <w:t>feltro</w:t>
+      </w:r>
+      <w:r>
+        <w:rPr>
+          <w:b w:val="0"/>
+          <w:bCs w:val="0"/>
+        </w:rPr>
+        <w:t>.</w:t>
       </w:r>
     </w:p>
     <w:p>
@@ -1715,12 +1745,56 @@
       <w:pPr>
         <w:ind w:firstLine="284"/>
         <w:jc w:val="both"/>
-      </w:pPr>
+        <w:rPr>
+          <w:sz w:val="24"/>
+        </w:rPr>
+      </w:pPr>
+      <w:r>
+        <w:rPr>
+          <w:sz w:val="24"/>
+        </w:rPr>
+        <w:t xml:space="preserve">A implementação de um sistema automatizado com um sensor que regula o feltro no centro do um cilindro oferece diversos ganhos potenciais, principalmente em termos de eficiência, qualidade </w:t>
+      </w:r>
+      <w:r>
+        <w:rPr>
+          <w:sz w:val="24"/>
+        </w:rPr>
+        <w:t>no</w:t>
+      </w:r>
+      <w:r>
+        <w:rPr>
+          <w:sz w:val="24"/>
+        </w:rPr>
+        <w:t xml:space="preserve"> pr</w:t>
+      </w:r>
+      <w:r>
+        <w:rPr>
+          <w:sz w:val="24"/>
+        </w:rPr>
+        <w:t>ocesso produtivo</w:t>
+      </w:r>
+      <w:r>
+        <w:rPr>
+          <w:sz w:val="24"/>
+        </w:rPr>
+        <w:t xml:space="preserve">, e redução de custos com manutenção </w:t>
+      </w:r>
+      <w:r>
+        <w:rPr>
+          <w:sz w:val="24"/>
+        </w:rPr>
+        <w:t>predi</w:t>
+      </w:r>
+      <w:r>
+        <w:rPr>
+          <w:sz w:val="24"/>
+        </w:rPr>
+        <w:t xml:space="preserve">tiva. </w:t>
+      </w:r>
     </w:p>
     <w:p>
       <w:pPr>
         <w:ind w:firstLine="284"/>
-        <w:jc w:val="both"/>
       </w:pPr>
     </w:p>
     <w:p>
@@ -1836,7 +1910,6 @@
     <w:p>
       <w:pPr>
         <w:ind w:firstLine="284"/>
-        <w:jc w:val="both"/>
       </w:pPr>
       <w:r>
         <w:t xml:space="preserve">O diagrama a seguir apresenta </w:t>
@@ -1851,7 +1924,10 @@
         <w:t>a identificação do problema</w:t>
       </w:r>
       <w:r>
-        <w:t xml:space="preserve">, detalhamento dos requisitos </w:t>
+        <w:t>, detalhamento dos requisitos</w:t>
+      </w:r>
+      <w:r>
+        <w:t>.</w:t>
       </w:r>
     </w:p>
     <w:p>
@@ -1876,7 +1952,7 @@
         </w:rPr>
         <w:lastRenderedPageBreak/>
         <w:drawing>
-          <wp:anchor distT="0" distB="0" distL="114300" distR="114300" simplePos="0" relativeHeight="251659264" behindDoc="1" locked="0" layoutInCell="1" allowOverlap="1" wp14:anchorId="06C5BEBC" wp14:editId="6F2601B4">
+          <wp:anchor distT="0" distB="0" distL="114300" distR="114300" simplePos="0" relativeHeight="251659264" behindDoc="1" locked="0" layoutInCell="1" allowOverlap="1" wp14:anchorId="06C5BEBC" wp14:editId="3A19FFAE">
             <wp:simplePos x="0" y="0"/>
             <wp:positionH relativeFrom="margin">
               <wp:posOffset>-782955</wp:posOffset>
@@ -1958,6 +2034,147 @@
     </w:p>
     <w:p>
       <w:pPr>
+        <w:pStyle w:val="PargrafodaLista"/>
+        <w:numPr>
+          <w:ilvl w:val="0"/>
+          <w:numId w:val="28"/>
+        </w:numPr>
+        <w:jc w:val="both"/>
+      </w:pPr>
+      <w:r>
+        <w:t xml:space="preserve">Sensoriamento: Instalação de </w:t>
+      </w:r>
+      <w:r>
+        <w:t xml:space="preserve">sensores </w:t>
+      </w:r>
+      <w:r>
+        <w:t>ópticos n</w:t>
+      </w:r>
+      <w:r>
+        <w:t>a</w:t>
+      </w:r>
+      <w:r>
+        <w:t xml:space="preserve">s </w:t>
+      </w:r>
+      <w:r>
+        <w:t>extremidades do cilindro para controle de movimentação do feltro.</w:t>
+      </w:r>
+    </w:p>
+    <w:p>
+      <w:pPr>
+        <w:pStyle w:val="PargrafodaLista"/>
+        <w:ind w:left="1080"/>
+        <w:jc w:val="both"/>
+      </w:pPr>
+    </w:p>
+    <w:p>
+      <w:pPr>
+        <w:pStyle w:val="PargrafodaLista"/>
+        <w:numPr>
+          <w:ilvl w:val="0"/>
+          <w:numId w:val="28"/>
+        </w:numPr>
+        <w:jc w:val="both"/>
+      </w:pPr>
+      <w:r>
+        <w:t>Aquisição de Dados: Utilização de microcontroladores (ESP32 ou similar) para leitura dos sensores.</w:t>
+      </w:r>
+    </w:p>
+    <w:p>
+      <w:pPr>
+        <w:ind w:left="360"/>
+        <w:jc w:val="both"/>
+      </w:pPr>
+    </w:p>
+    <w:p>
+      <w:pPr>
+        <w:pStyle w:val="PargrafodaLista"/>
+        <w:numPr>
+          <w:ilvl w:val="0"/>
+          <w:numId w:val="28"/>
+        </w:numPr>
+        <w:jc w:val="both"/>
+      </w:pPr>
+      <w:r>
+        <w:t>Comunicação: Envio de dados via Wi-Fi utilizando protocolo MQTT para servidor local ou em nuvem.</w:t>
+      </w:r>
+    </w:p>
+    <w:p>
+      <w:pPr>
+        <w:ind w:left="360"/>
+        <w:jc w:val="both"/>
+      </w:pPr>
+    </w:p>
+    <w:p>
+      <w:pPr>
+        <w:pStyle w:val="PargrafodaLista"/>
+        <w:numPr>
+          <w:ilvl w:val="0"/>
+          <w:numId w:val="28"/>
+        </w:numPr>
+        <w:jc w:val="both"/>
+      </w:pPr>
+      <w:r>
+        <w:t>Processamento: Armazenamento de dados em banco de dados (ex.: InfluxDB).</w:t>
+      </w:r>
+    </w:p>
+    <w:p>
+      <w:pPr>
+        <w:ind w:left="360"/>
+        <w:jc w:val="both"/>
+      </w:pPr>
+    </w:p>
+    <w:p>
+      <w:pPr>
+        <w:pStyle w:val="PargrafodaLista"/>
+        <w:numPr>
+          <w:ilvl w:val="0"/>
+          <w:numId w:val="28"/>
+        </w:numPr>
+        <w:jc w:val="both"/>
+      </w:pPr>
+      <w:r>
+        <w:lastRenderedPageBreak/>
+        <w:t>Visualização: Criação de dashboard no Node-RED ou Grafana com histórico, gráficos e indicadores.</w:t>
+      </w:r>
+    </w:p>
+    <w:p>
+      <w:pPr>
+        <w:pStyle w:val="PargrafodaLista"/>
+      </w:pPr>
+    </w:p>
+    <w:p>
+      <w:pPr>
+        <w:pStyle w:val="PargrafodaLista"/>
+        <w:numPr>
+          <w:ilvl w:val="0"/>
+          <w:numId w:val="28"/>
+        </w:numPr>
+        <w:jc w:val="both"/>
+      </w:pPr>
+      <w:r>
+        <w:t>Alertas: Envio de notificações por e-mail, Telegram ou SMS em caso de consumo anormal.</w:t>
+      </w:r>
+    </w:p>
+    <w:p>
+      <w:pPr>
+        <w:pStyle w:val="PargrafodaLista"/>
+        <w:jc w:val="both"/>
+      </w:pPr>
+    </w:p>
+    <w:p>
+      <w:pPr>
+        <w:ind w:left="360"/>
+        <w:jc w:val="both"/>
+      </w:pPr>
+    </w:p>
+    <w:p>
+      <w:pPr>
+        <w:jc w:val="both"/>
+      </w:pPr>
+    </w:p>
+    <w:p>
+      <w:pPr>
         <w:pStyle w:val="EstiloTtulo1TimesNewRoman"/>
         <w:ind w:left="284"/>
         <w:rPr>
@@ -1994,7 +2211,7 @@
         <w:pStyle w:val="EstiloTtulo1TimesNewRoman"/>
         <w:numPr>
           <w:ilvl w:val="0"/>
-          <w:numId w:val="11"/>
+          <w:numId w:val="28"/>
         </w:numPr>
         <w:ind w:left="284" w:hanging="284"/>
         <w:rPr>
@@ -2139,7 +2356,7 @@
                 <w:sz w:val="20"/>
                 <w:szCs w:val="20"/>
               </w:rPr>
-              <w:t>Empresa exemplo</w:t>
+              <w:t xml:space="preserve">Empresa </w:t>
             </w:r>
             <w:r>
               <w:rPr>
@@ -2147,7 +2364,7 @@
                 <w:sz w:val="20"/>
                 <w:szCs w:val="20"/>
               </w:rPr>
-              <w:t xml:space="preserve"> </w:t>
+              <w:t>BV Têxtil</w:t>
             </w:r>
           </w:p>
         </w:tc>
@@ -2230,7 +2447,7 @@
                 <w:sz w:val="20"/>
                 <w:szCs w:val="20"/>
               </w:rPr>
-              <w:t>Aluno</w:t>
+              <w:t>Antonio Jair Lopes de Jesus</w:t>
             </w:r>
           </w:p>
         </w:tc>
@@ -2254,6 +2471,14 @@
                 <w:szCs w:val="20"/>
               </w:rPr>
             </w:pPr>
+            <w:r>
+              <w:rPr>
+                <w:rFonts w:asciiTheme="minorHAnsi" w:hAnsiTheme="minorHAnsi"/>
+                <w:sz w:val="20"/>
+                <w:szCs w:val="20"/>
+              </w:rPr>
+              <w:t>Antonio Jair Lopes de Jesus</w:t>
+            </w:r>
             <w:r>
               <w:rPr>
                 <w:rFonts w:asciiTheme="minorHAnsi" w:hAnsiTheme="minorHAnsi"/>
@@ -2636,6 +2861,95 @@
 <file path=word/numbering.xml><?xml version="1.0" encoding="utf-8"?>
 <w:numbering xmlns:wpc="http://schemas.microsoft.com/office/word/2010/wordprocessingCanvas" xmlns:cx="http://schemas.microsoft.com/office/drawing/2014/chartex" xmlns:cx1="http://schemas.microsoft.com/office/drawing/2015/9/8/chartex" xmlns:cx2="http://schemas.microsoft.com/office/drawing/2015/10/21/chartex" xmlns:cx3="http://schemas.microsoft.com/office/drawing/2016/5/9/chartex" xmlns:cx4="http://schemas.microsoft.com/office/drawing/2016/5/10/chartex" xmlns:cx5="http://schemas.microsoft.com/office/drawing/2016/5/11/chartex" xmlns:cx6="http://schemas.microsoft.com/office/drawing/2016/5/12/chartex" xmlns:cx7="http://schemas.microsoft.com/office/drawing/2016/5/13/chartex" xmlns:cx8="http://schemas.microsoft.com/office/drawing/2016/5/14/chartex" xmlns:mc="http://schemas.openxmlformats.org/markup-compatibility/2006" xmlns:aink="http://schemas.microsoft.com/office/drawing/2016/ink" xmlns:am3d="http://schemas.microsoft.com/office/drawing/2017/model3d" xmlns:o="urn:schemas-microsoft-com:office:office" xmlns:oel="http://schemas.microsoft.com/office/2019/extlst" xmlns:r="http://schemas.openxmlformats.org/officeDocument/2006/relationships" xmlns:m="http://schemas.openxmlformats.org/officeDocument/2006/math" xmlns:v="urn:schemas-microsoft-com:vml" xmlns:wp14="http://schemas.microsoft.com/office/word/2010/wordprocessingDrawing" xmlns:wp="http://schemas.openxmlformats.org/drawingml/2006/wordprocessingDrawing" xmlns:w10="urn:schemas-microsoft-com:office:word" xmlns:w="http://schemas.openxmlformats.org/wordprocessingml/2006/main" xmlns:w14="http://schemas.microsoft.com/office/word/2010/wordml" xmlns:w15="http://schemas.microsoft.com/office/word/2012/wordml" xmlns:w16cex="http://schemas.microsoft.com/office/word/2018/wordml/cex" xmlns:w16cid="http://schemas.microsoft.com/office/word/2016/wordml/cid" xmlns:w16="http://schemas.microsoft.com/office/word/2018/wordml" xmlns:w16sdtdh="http://schemas.microsoft.com/office/word/2020/wordml/sdtdatahash" xmlns:w16se="http://schemas.microsoft.com/office/word/2015/wordml/symex" xmlns:wpg="http://schemas.microsoft.com/office/word/2010/wordprocessingGroup" xmlns:wpi="http://schemas.microsoft.com/office/word/2010/wordprocessingInk" xmlns:wne="http://schemas.microsoft.com/office/word/2006/wordml" xmlns:wps="http://schemas.microsoft.com/office/word/2010/wordprocessingShape" mc:Ignorable="w14 w15 w16se w16cid w16 w16cex w16sdtdh wp14">
   <w:abstractNum w:abstractNumId="0" w15:restartNumberingAfterBreak="0">
+    <w:nsid w:val="04654A37"/>
+    <w:multiLevelType w:val="hybridMultilevel"/>
+    <w:tmpl w:val="6AB4F998"/>
+    <w:lvl w:ilvl="0" w:tplc="383A733E">
+      <w:start w:val="1"/>
+      <w:numFmt w:val="decimal"/>
+      <w:lvlText w:val="%1"/>
+      <w:lvlJc w:val="left"/>
+      <w:pPr>
+        <w:ind w:left="1080" w:hanging="360"/>
+      </w:pPr>
+      <w:rPr>
+        <w:rFonts w:hint="default"/>
+      </w:rPr>
+    </w:lvl>
+    <w:lvl w:ilvl="1" w:tplc="04160019" w:tentative="1">
+      <w:start w:val="1"/>
+      <w:numFmt w:val="lowerLetter"/>
+      <w:lvlText w:val="%2."/>
+      <w:lvlJc w:val="left"/>
+      <w:pPr>
+        <w:ind w:left="1800" w:hanging="360"/>
+      </w:pPr>
+    </w:lvl>
+    <w:lvl w:ilvl="2" w:tplc="0416001B" w:tentative="1">
+      <w:start w:val="1"/>
+      <w:numFmt w:val="lowerRoman"/>
+      <w:lvlText w:val="%3."/>
+      <w:lvlJc w:val="right"/>
+      <w:pPr>
+        <w:ind w:left="2520" w:hanging="180"/>
+      </w:pPr>
+    </w:lvl>
+    <w:lvl w:ilvl="3" w:tplc="0416000F" w:tentative="1">
+      <w:start w:val="1"/>
+      <w:numFmt w:val="decimal"/>
+      <w:lvlText w:val="%4."/>
+      <w:lvlJc w:val="left"/>
+      <w:pPr>
+        <w:ind w:left="3240" w:hanging="360"/>
+      </w:pPr>
+    </w:lvl>
+    <w:lvl w:ilvl="4" w:tplc="04160019" w:tentative="1">
+      <w:start w:val="1"/>
+      <w:numFmt w:val="lowerLetter"/>
+      <w:lvlText w:val="%5."/>
+      <w:lvlJc w:val="left"/>
+      <w:pPr>
+        <w:ind w:left="3960" w:hanging="360"/>
+      </w:pPr>
+    </w:lvl>
+    <w:lvl w:ilvl="5" w:tplc="0416001B" w:tentative="1">
+      <w:start w:val="1"/>
+      <w:numFmt w:val="lowerRoman"/>
+      <w:lvlText w:val="%6."/>
+      <w:lvlJc w:val="right"/>
+      <w:pPr>
+        <w:ind w:left="4680" w:hanging="180"/>
+      </w:pPr>
+    </w:lvl>
+    <w:lvl w:ilvl="6" w:tplc="0416000F" w:tentative="1">
+      <w:start w:val="1"/>
+      <w:numFmt w:val="decimal"/>
+      <w:lvlText w:val="%7."/>
+      <w:lvlJc w:val="left"/>
+      <w:pPr>
+        <w:ind w:left="5400" w:hanging="360"/>
+      </w:pPr>
+    </w:lvl>
+    <w:lvl w:ilvl="7" w:tplc="04160019" w:tentative="1">
+      <w:start w:val="1"/>
+      <w:numFmt w:val="lowerLetter"/>
+      <w:lvlText w:val="%8."/>
+      <w:lvlJc w:val="left"/>
+      <w:pPr>
+        <w:ind w:left="6120" w:hanging="360"/>
+      </w:pPr>
+    </w:lvl>
+    <w:lvl w:ilvl="8" w:tplc="0416001B" w:tentative="1">
+      <w:start w:val="1"/>
+      <w:numFmt w:val="lowerRoman"/>
+      <w:lvlText w:val="%9."/>
+      <w:lvlJc w:val="right"/>
+      <w:pPr>
+        <w:ind w:left="6840" w:hanging="180"/>
+      </w:pPr>
+    </w:lvl>
+  </w:abstractNum>
+  <w:abstractNum w:abstractNumId="1" w15:restartNumberingAfterBreak="0">
     <w:nsid w:val="06F9334A"/>
     <w:multiLevelType w:val="hybridMultilevel"/>
     <w:tmpl w:val="B1941AD6"/>
@@ -2748,7 +3062,7 @@
       </w:rPr>
     </w:lvl>
   </w:abstractNum>
-  <w:abstractNum w:abstractNumId="1" w15:restartNumberingAfterBreak="0">
+  <w:abstractNum w:abstractNumId="2" w15:restartNumberingAfterBreak="0">
     <w:nsid w:val="0BB41893"/>
     <w:multiLevelType w:val="hybridMultilevel"/>
     <w:tmpl w:val="FED253B0"/>
@@ -2861,7 +3175,7 @@
       </w:pPr>
     </w:lvl>
   </w:abstractNum>
-  <w:abstractNum w:abstractNumId="2" w15:restartNumberingAfterBreak="0">
+  <w:abstractNum w:abstractNumId="3" w15:restartNumberingAfterBreak="0">
     <w:nsid w:val="104F6430"/>
     <w:multiLevelType w:val="hybridMultilevel"/>
     <w:tmpl w:val="AE5A6794"/>
@@ -2974,7 +3288,7 @@
       </w:rPr>
     </w:lvl>
   </w:abstractNum>
-  <w:abstractNum w:abstractNumId="3" w15:restartNumberingAfterBreak="0">
+  <w:abstractNum w:abstractNumId="4" w15:restartNumberingAfterBreak="0">
     <w:nsid w:val="12561552"/>
     <w:multiLevelType w:val="multilevel"/>
     <w:tmpl w:val="51D270CA"/>
@@ -3114,7 +3428,7 @@
       </w:rPr>
     </w:lvl>
   </w:abstractNum>
-  <w:abstractNum w:abstractNumId="4" w15:restartNumberingAfterBreak="0">
+  <w:abstractNum w:abstractNumId="5" w15:restartNumberingAfterBreak="0">
     <w:nsid w:val="13C34127"/>
     <w:multiLevelType w:val="hybridMultilevel"/>
     <w:tmpl w:val="79F4E820"/>
@@ -3227,7 +3541,96 @@
       </w:rPr>
     </w:lvl>
   </w:abstractNum>
-  <w:abstractNum w:abstractNumId="5" w15:restartNumberingAfterBreak="0">
+  <w:abstractNum w:abstractNumId="6" w15:restartNumberingAfterBreak="0">
+    <w:nsid w:val="1544077A"/>
+    <w:multiLevelType w:val="hybridMultilevel"/>
+    <w:tmpl w:val="98FC62E2"/>
+    <w:lvl w:ilvl="0" w:tplc="0416000F">
+      <w:start w:val="1"/>
+      <w:numFmt w:val="decimal"/>
+      <w:lvlText w:val="%1."/>
+      <w:lvlJc w:val="left"/>
+      <w:pPr>
+        <w:ind w:left="720" w:hanging="360"/>
+      </w:pPr>
+      <w:rPr>
+        <w:rFonts w:hint="default"/>
+      </w:rPr>
+    </w:lvl>
+    <w:lvl w:ilvl="1" w:tplc="04160019" w:tentative="1">
+      <w:start w:val="1"/>
+      <w:numFmt w:val="lowerLetter"/>
+      <w:lvlText w:val="%2."/>
+      <w:lvlJc w:val="left"/>
+      <w:pPr>
+        <w:ind w:left="1440" w:hanging="360"/>
+      </w:pPr>
+    </w:lvl>
+    <w:lvl w:ilvl="2" w:tplc="0416001B" w:tentative="1">
+      <w:start w:val="1"/>
+      <w:numFmt w:val="lowerRoman"/>
+      <w:lvlText w:val="%3."/>
+      <w:lvlJc w:val="right"/>
+      <w:pPr>
+        <w:ind w:left="2160" w:hanging="180"/>
+      </w:pPr>
+    </w:lvl>
+    <w:lvl w:ilvl="3" w:tplc="0416000F" w:tentative="1">
+      <w:start w:val="1"/>
+      <w:numFmt w:val="decimal"/>
+      <w:lvlText w:val="%4."/>
+      <w:lvlJc w:val="left"/>
+      <w:pPr>
+        <w:ind w:left="2880" w:hanging="360"/>
+      </w:pPr>
+    </w:lvl>
+    <w:lvl w:ilvl="4" w:tplc="04160019" w:tentative="1">
+      <w:start w:val="1"/>
+      <w:numFmt w:val="lowerLetter"/>
+      <w:lvlText w:val="%5."/>
+      <w:lvlJc w:val="left"/>
+      <w:pPr>
+        <w:ind w:left="3600" w:hanging="360"/>
+      </w:pPr>
+    </w:lvl>
+    <w:lvl w:ilvl="5" w:tplc="0416001B" w:tentative="1">
+      <w:start w:val="1"/>
+      <w:numFmt w:val="lowerRoman"/>
+      <w:lvlText w:val="%6."/>
+      <w:lvlJc w:val="right"/>
+      <w:pPr>
+        <w:ind w:left="4320" w:hanging="180"/>
+      </w:pPr>
+    </w:lvl>
+    <w:lvl w:ilvl="6" w:tplc="0416000F" w:tentative="1">
+      <w:start w:val="1"/>
+      <w:numFmt w:val="decimal"/>
+      <w:lvlText w:val="%7."/>
+      <w:lvlJc w:val="left"/>
+      <w:pPr>
+        <w:ind w:left="5040" w:hanging="360"/>
+      </w:pPr>
+    </w:lvl>
+    <w:lvl w:ilvl="7" w:tplc="04160019" w:tentative="1">
+      <w:start w:val="1"/>
+      <w:numFmt w:val="lowerLetter"/>
+      <w:lvlText w:val="%8."/>
+      <w:lvlJc w:val="left"/>
+      <w:pPr>
+        <w:ind w:left="5760" w:hanging="360"/>
+      </w:pPr>
+    </w:lvl>
+    <w:lvl w:ilvl="8" w:tplc="0416001B" w:tentative="1">
+      <w:start w:val="1"/>
+      <w:numFmt w:val="lowerRoman"/>
+      <w:lvlText w:val="%9."/>
+      <w:lvlJc w:val="right"/>
+      <w:pPr>
+        <w:ind w:left="6480" w:hanging="180"/>
+      </w:pPr>
+    </w:lvl>
+  </w:abstractNum>
+  <w:abstractNum w:abstractNumId="7" w15:restartNumberingAfterBreak="0">
     <w:nsid w:val="16D806FE"/>
     <w:multiLevelType w:val="hybridMultilevel"/>
     <w:tmpl w:val="01FA3C9E"/>
@@ -3340,7 +3743,7 @@
       </w:pPr>
     </w:lvl>
   </w:abstractNum>
-  <w:abstractNum w:abstractNumId="6" w15:restartNumberingAfterBreak="0">
+  <w:abstractNum w:abstractNumId="8" w15:restartNumberingAfterBreak="0">
     <w:nsid w:val="18AA69EC"/>
     <w:multiLevelType w:val="hybridMultilevel"/>
     <w:tmpl w:val="9FFE7D44"/>
@@ -3453,7 +3856,7 @@
       </w:rPr>
     </w:lvl>
   </w:abstractNum>
-  <w:abstractNum w:abstractNumId="7" w15:restartNumberingAfterBreak="0">
+  <w:abstractNum w:abstractNumId="9" w15:restartNumberingAfterBreak="0">
     <w:nsid w:val="273A1D4E"/>
     <w:multiLevelType w:val="hybridMultilevel"/>
     <w:tmpl w:val="DD165672"/>
@@ -3544,7 +3947,7 @@
       </w:pPr>
     </w:lvl>
   </w:abstractNum>
-  <w:abstractNum w:abstractNumId="8" w15:restartNumberingAfterBreak="0">
+  <w:abstractNum w:abstractNumId="10" w15:restartNumberingAfterBreak="0">
     <w:nsid w:val="347D5909"/>
     <w:multiLevelType w:val="hybridMultilevel"/>
     <w:tmpl w:val="E476FE88"/>
@@ -3657,7 +4060,7 @@
       </w:rPr>
     </w:lvl>
   </w:abstractNum>
-  <w:abstractNum w:abstractNumId="9" w15:restartNumberingAfterBreak="0">
+  <w:abstractNum w:abstractNumId="11" w15:restartNumberingAfterBreak="0">
     <w:nsid w:val="378360A8"/>
     <w:multiLevelType w:val="multilevel"/>
     <w:tmpl w:val="01FA3C9E"/>
@@ -3770,7 +4173,7 @@
       </w:pPr>
     </w:lvl>
   </w:abstractNum>
-  <w:abstractNum w:abstractNumId="10" w15:restartNumberingAfterBreak="0">
+  <w:abstractNum w:abstractNumId="12" w15:restartNumberingAfterBreak="0">
     <w:nsid w:val="39216E85"/>
     <w:multiLevelType w:val="hybridMultilevel"/>
     <w:tmpl w:val="424A8EAC"/>
@@ -3883,7 +4286,7 @@
       </w:rPr>
     </w:lvl>
   </w:abstractNum>
-  <w:abstractNum w:abstractNumId="11" w15:restartNumberingAfterBreak="0">
+  <w:abstractNum w:abstractNumId="13" w15:restartNumberingAfterBreak="0">
     <w:nsid w:val="392C025E"/>
     <w:multiLevelType w:val="hybridMultilevel"/>
     <w:tmpl w:val="F5D22048"/>
@@ -3996,7 +4399,7 @@
       </w:rPr>
     </w:lvl>
   </w:abstractNum>
-  <w:abstractNum w:abstractNumId="12" w15:restartNumberingAfterBreak="0">
+  <w:abstractNum w:abstractNumId="14" w15:restartNumberingAfterBreak="0">
     <w:nsid w:val="3A0B71E2"/>
     <w:multiLevelType w:val="hybridMultilevel"/>
     <w:tmpl w:val="9BA0F2CE"/>
@@ -4109,7 +4512,7 @@
       </w:rPr>
     </w:lvl>
   </w:abstractNum>
-  <w:abstractNum w:abstractNumId="13" w15:restartNumberingAfterBreak="0">
+  <w:abstractNum w:abstractNumId="15" w15:restartNumberingAfterBreak="0">
     <w:nsid w:val="3AF04CB5"/>
     <w:multiLevelType w:val="hybridMultilevel"/>
     <w:tmpl w:val="0ED20B06"/>
@@ -4222,7 +4625,7 @@
       </w:rPr>
     </w:lvl>
   </w:abstractNum>
-  <w:abstractNum w:abstractNumId="14" w15:restartNumberingAfterBreak="0">
+  <w:abstractNum w:abstractNumId="16" w15:restartNumberingAfterBreak="0">
     <w:nsid w:val="3DC610E8"/>
     <w:multiLevelType w:val="hybridMultilevel"/>
     <w:tmpl w:val="B1083066"/>
@@ -4335,7 +4738,96 @@
       </w:rPr>
     </w:lvl>
   </w:abstractNum>
-  <w:abstractNum w:abstractNumId="15" w15:restartNumberingAfterBreak="0">
+  <w:abstractNum w:abstractNumId="17" w15:restartNumberingAfterBreak="0">
+    <w:nsid w:val="41410955"/>
+    <w:multiLevelType w:val="hybridMultilevel"/>
+    <w:tmpl w:val="7D2C9220"/>
+    <w:lvl w:ilvl="0" w:tplc="BAFCC87A">
+      <w:start w:val="1"/>
+      <w:numFmt w:val="decimal"/>
+      <w:lvlText w:val="%1"/>
+      <w:lvlJc w:val="left"/>
+      <w:pPr>
+        <w:ind w:left="720" w:hanging="360"/>
+      </w:pPr>
+      <w:rPr>
+        <w:rFonts w:hint="default"/>
+      </w:rPr>
+    </w:lvl>
+    <w:lvl w:ilvl="1" w:tplc="04160019" w:tentative="1">
+      <w:start w:val="1"/>
+      <w:numFmt w:val="lowerLetter"/>
+      <w:lvlText w:val="%2."/>
+      <w:lvlJc w:val="left"/>
+      <w:pPr>
+        <w:ind w:left="1440" w:hanging="360"/>
+      </w:pPr>
+    </w:lvl>
+    <w:lvl w:ilvl="2" w:tplc="0416001B" w:tentative="1">
+      <w:start w:val="1"/>
+      <w:numFmt w:val="lowerRoman"/>
+      <w:lvlText w:val="%3."/>
+      <w:lvlJc w:val="right"/>
+      <w:pPr>
+        <w:ind w:left="2160" w:hanging="180"/>
+      </w:pPr>
+    </w:lvl>
+    <w:lvl w:ilvl="3" w:tplc="0416000F" w:tentative="1">
+      <w:start w:val="1"/>
+      <w:numFmt w:val="decimal"/>
+      <w:lvlText w:val="%4."/>
+      <w:lvlJc w:val="left"/>
+      <w:pPr>
+        <w:ind w:left="2880" w:hanging="360"/>
+      </w:pPr>
+    </w:lvl>
+    <w:lvl w:ilvl="4" w:tplc="04160019" w:tentative="1">
+      <w:start w:val="1"/>
+      <w:numFmt w:val="lowerLetter"/>
+      <w:lvlText w:val="%5."/>
+      <w:lvlJc w:val="left"/>
+      <w:pPr>
+        <w:ind w:left="3600" w:hanging="360"/>
+      </w:pPr>
+    </w:lvl>
+    <w:lvl w:ilvl="5" w:tplc="0416001B" w:tentative="1">
+      <w:start w:val="1"/>
+      <w:numFmt w:val="lowerRoman"/>
+      <w:lvlText w:val="%6."/>
+      <w:lvlJc w:val="right"/>
+      <w:pPr>
+        <w:ind w:left="4320" w:hanging="180"/>
+      </w:pPr>
+    </w:lvl>
+    <w:lvl w:ilvl="6" w:tplc="0416000F" w:tentative="1">
+      <w:start w:val="1"/>
+      <w:numFmt w:val="decimal"/>
+      <w:lvlText w:val="%7."/>
+      <w:lvlJc w:val="left"/>
+      <w:pPr>
+        <w:ind w:left="5040" w:hanging="360"/>
+      </w:pPr>
+    </w:lvl>
+    <w:lvl w:ilvl="7" w:tplc="04160019" w:tentative="1">
+      <w:start w:val="1"/>
+      <w:numFmt w:val="lowerLetter"/>
+      <w:lvlText w:val="%8."/>
+      <w:lvlJc w:val="left"/>
+      <w:pPr>
+        <w:ind w:left="5760" w:hanging="360"/>
+      </w:pPr>
+    </w:lvl>
+    <w:lvl w:ilvl="8" w:tplc="0416001B" w:tentative="1">
+      <w:start w:val="1"/>
+      <w:numFmt w:val="lowerRoman"/>
+      <w:lvlText w:val="%9."/>
+      <w:lvlJc w:val="right"/>
+      <w:pPr>
+        <w:ind w:left="6480" w:hanging="180"/>
+      </w:pPr>
+    </w:lvl>
+  </w:abstractNum>
+  <w:abstractNum w:abstractNumId="18" w15:restartNumberingAfterBreak="0">
     <w:nsid w:val="42A85E5C"/>
     <w:multiLevelType w:val="hybridMultilevel"/>
     <w:tmpl w:val="AC5CCB08"/>
@@ -4475,7 +4967,7 @@
       </w:rPr>
     </w:lvl>
   </w:abstractNum>
-  <w:abstractNum w:abstractNumId="16" w15:restartNumberingAfterBreak="0">
+  <w:abstractNum w:abstractNumId="19" w15:restartNumberingAfterBreak="0">
     <w:nsid w:val="451C74ED"/>
     <w:multiLevelType w:val="hybridMultilevel"/>
     <w:tmpl w:val="95FC905E"/>
@@ -4588,7 +5080,7 @@
       </w:rPr>
     </w:lvl>
   </w:abstractNum>
-  <w:abstractNum w:abstractNumId="17" w15:restartNumberingAfterBreak="0">
+  <w:abstractNum w:abstractNumId="20" w15:restartNumberingAfterBreak="0">
     <w:nsid w:val="4B9D0BFA"/>
     <w:multiLevelType w:val="hybridMultilevel"/>
     <w:tmpl w:val="4C56D9DC"/>
@@ -4701,7 +5193,7 @@
       </w:pPr>
     </w:lvl>
   </w:abstractNum>
-  <w:abstractNum w:abstractNumId="18" w15:restartNumberingAfterBreak="0">
+  <w:abstractNum w:abstractNumId="21" w15:restartNumberingAfterBreak="0">
     <w:nsid w:val="4CB44E48"/>
     <w:multiLevelType w:val="hybridMultilevel"/>
     <w:tmpl w:val="B796A014"/>
@@ -4790,7 +5282,7 @@
       </w:pPr>
     </w:lvl>
   </w:abstractNum>
-  <w:abstractNum w:abstractNumId="19" w15:restartNumberingAfterBreak="0">
+  <w:abstractNum w:abstractNumId="22" w15:restartNumberingAfterBreak="0">
     <w:nsid w:val="52182F04"/>
     <w:multiLevelType w:val="hybridMultilevel"/>
     <w:tmpl w:val="F1226432"/>
@@ -4903,7 +5395,7 @@
       </w:rPr>
     </w:lvl>
   </w:abstractNum>
-  <w:abstractNum w:abstractNumId="20" w15:restartNumberingAfterBreak="0">
+  <w:abstractNum w:abstractNumId="23" w15:restartNumberingAfterBreak="0">
     <w:nsid w:val="5EF64264"/>
     <w:multiLevelType w:val="hybridMultilevel"/>
     <w:tmpl w:val="51D270CA"/>
@@ -5043,7 +5535,7 @@
       </w:rPr>
     </w:lvl>
   </w:abstractNum>
-  <w:abstractNum w:abstractNumId="21" w15:restartNumberingAfterBreak="0">
+  <w:abstractNum w:abstractNumId="24" w15:restartNumberingAfterBreak="0">
     <w:nsid w:val="63E76395"/>
     <w:multiLevelType w:val="hybridMultilevel"/>
     <w:tmpl w:val="11485C26"/>
@@ -5156,7 +5648,7 @@
       </w:pPr>
     </w:lvl>
   </w:abstractNum>
-  <w:abstractNum w:abstractNumId="22" w15:restartNumberingAfterBreak="0">
+  <w:abstractNum w:abstractNumId="25" w15:restartNumberingAfterBreak="0">
     <w:nsid w:val="65C207B9"/>
     <w:multiLevelType w:val="hybridMultilevel"/>
     <w:tmpl w:val="ECB8D116"/>
@@ -5242,7 +5734,7 @@
       </w:pPr>
     </w:lvl>
   </w:abstractNum>
-  <w:abstractNum w:abstractNumId="23" w15:restartNumberingAfterBreak="0">
+  <w:abstractNum w:abstractNumId="26" w15:restartNumberingAfterBreak="0">
     <w:nsid w:val="6DFA542E"/>
     <w:multiLevelType w:val="hybridMultilevel"/>
     <w:tmpl w:val="E3FCC25A"/>
@@ -5328,7 +5820,7 @@
       </w:pPr>
     </w:lvl>
   </w:abstractNum>
-  <w:abstractNum w:abstractNumId="24" w15:restartNumberingAfterBreak="0">
+  <w:abstractNum w:abstractNumId="27" w15:restartNumberingAfterBreak="0">
     <w:nsid w:val="6F33404A"/>
     <w:multiLevelType w:val="hybridMultilevel"/>
     <w:tmpl w:val="1F5699FA"/>
@@ -5441,7 +5933,7 @@
       </w:rPr>
     </w:lvl>
   </w:abstractNum>
-  <w:abstractNum w:abstractNumId="25" w15:restartNumberingAfterBreak="0">
+  <w:abstractNum w:abstractNumId="28" w15:restartNumberingAfterBreak="0">
     <w:nsid w:val="7B7F03C4"/>
     <w:multiLevelType w:val="hybridMultilevel"/>
     <w:tmpl w:val="DE24A59A"/>
@@ -5528,82 +6020,91 @@
     </w:lvl>
   </w:abstractNum>
   <w:num w:numId="1" w16cid:durableId="135953083">
-    <w:abstractNumId w:val="17"/>
+    <w:abstractNumId w:val="20"/>
   </w:num>
   <w:num w:numId="2" w16cid:durableId="1269653680">
-    <w:abstractNumId w:val="20"/>
+    <w:abstractNumId w:val="23"/>
   </w:num>
   <w:num w:numId="3" w16cid:durableId="1080979534">
+    <w:abstractNumId w:val="18"/>
+  </w:num>
+  <w:num w:numId="4" w16cid:durableId="662393274">
+    <w:abstractNumId w:val="2"/>
+  </w:num>
+  <w:num w:numId="5" w16cid:durableId="1481649090">
+    <w:abstractNumId w:val="4"/>
+  </w:num>
+  <w:num w:numId="6" w16cid:durableId="929849178">
+    <w:abstractNumId w:val="7"/>
+  </w:num>
+  <w:num w:numId="7" w16cid:durableId="777674092">
+    <w:abstractNumId w:val="11"/>
+  </w:num>
+  <w:num w:numId="8" w16cid:durableId="389697876">
+    <w:abstractNumId w:val="24"/>
+  </w:num>
+  <w:num w:numId="9" w16cid:durableId="1636594331">
+    <w:abstractNumId w:val="26"/>
+  </w:num>
+  <w:num w:numId="10" w16cid:durableId="1055353553">
+    <w:abstractNumId w:val="28"/>
+  </w:num>
+  <w:num w:numId="11" w16cid:durableId="599916902">
+    <w:abstractNumId w:val="25"/>
+  </w:num>
+  <w:num w:numId="12" w16cid:durableId="1965695097">
+    <w:abstractNumId w:val="21"/>
+  </w:num>
+  <w:num w:numId="13" w16cid:durableId="2028866002">
+    <w:abstractNumId w:val="14"/>
+  </w:num>
+  <w:num w:numId="14" w16cid:durableId="1686134241">
+    <w:abstractNumId w:val="8"/>
+  </w:num>
+  <w:num w:numId="15" w16cid:durableId="1538545686">
+    <w:abstractNumId w:val="1"/>
+  </w:num>
+  <w:num w:numId="16" w16cid:durableId="101536041">
+    <w:abstractNumId w:val="19"/>
+  </w:num>
+  <w:num w:numId="17" w16cid:durableId="825701704">
+    <w:abstractNumId w:val="12"/>
+  </w:num>
+  <w:num w:numId="18" w16cid:durableId="1204749873">
+    <w:abstractNumId w:val="13"/>
+  </w:num>
+  <w:num w:numId="19" w16cid:durableId="1938319490">
+    <w:abstractNumId w:val="27"/>
+  </w:num>
+  <w:num w:numId="20" w16cid:durableId="1611817721">
+    <w:abstractNumId w:val="10"/>
+  </w:num>
+  <w:num w:numId="21" w16cid:durableId="666638809">
+    <w:abstractNumId w:val="22"/>
+  </w:num>
+  <w:num w:numId="22" w16cid:durableId="694234799">
+    <w:abstractNumId w:val="16"/>
+  </w:num>
+  <w:num w:numId="23" w16cid:durableId="1086538186">
+    <w:abstractNumId w:val="5"/>
+  </w:num>
+  <w:num w:numId="24" w16cid:durableId="2007707210">
+    <w:abstractNumId w:val="3"/>
+  </w:num>
+  <w:num w:numId="25" w16cid:durableId="1269629032">
     <w:abstractNumId w:val="15"/>
   </w:num>
-  <w:num w:numId="4" w16cid:durableId="662393274">
-    <w:abstractNumId w:val="1"/>
-  </w:num>
-  <w:num w:numId="5" w16cid:durableId="1481649090">
-    <w:abstractNumId w:val="3"/>
-  </w:num>
-  <w:num w:numId="6" w16cid:durableId="929849178">
-    <w:abstractNumId w:val="5"/>
-  </w:num>
-  <w:num w:numId="7" w16cid:durableId="777674092">
+  <w:num w:numId="26" w16cid:durableId="306127869">
     <w:abstractNumId w:val="9"/>
   </w:num>
-  <w:num w:numId="8" w16cid:durableId="389697876">
-    <w:abstractNumId w:val="21"/>
+  <w:num w:numId="27" w16cid:durableId="1671256827">
+    <w:abstractNumId w:val="0"/>
   </w:num>
-  <w:num w:numId="9" w16cid:durableId="1636594331">
-    <w:abstractNumId w:val="23"/>
-  </w:num>
-  <w:num w:numId="10" w16cid:durableId="1055353553">
-    <w:abstractNumId w:val="25"/>
-  </w:num>
-  <w:num w:numId="11" w16cid:durableId="599916902">
-    <w:abstractNumId w:val="22"/>
-  </w:num>
-  <w:num w:numId="12" w16cid:durableId="1965695097">
-    <w:abstractNumId w:val="18"/>
-  </w:num>
-  <w:num w:numId="13" w16cid:durableId="2028866002">
-    <w:abstractNumId w:val="12"/>
-  </w:num>
-  <w:num w:numId="14" w16cid:durableId="1686134241">
+  <w:num w:numId="28" w16cid:durableId="814373696">
     <w:abstractNumId w:val="6"/>
   </w:num>
-  <w:num w:numId="15" w16cid:durableId="1538545686">
-    <w:abstractNumId w:val="0"/>
-  </w:num>
-  <w:num w:numId="16" w16cid:durableId="101536041">
-    <w:abstractNumId w:val="16"/>
-  </w:num>
-  <w:num w:numId="17" w16cid:durableId="825701704">
-    <w:abstractNumId w:val="10"/>
-  </w:num>
-  <w:num w:numId="18" w16cid:durableId="1204749873">
-    <w:abstractNumId w:val="11"/>
-  </w:num>
-  <w:num w:numId="19" w16cid:durableId="1938319490">
-    <w:abstractNumId w:val="24"/>
-  </w:num>
-  <w:num w:numId="20" w16cid:durableId="1611817721">
-    <w:abstractNumId w:val="8"/>
-  </w:num>
-  <w:num w:numId="21" w16cid:durableId="666638809">
-    <w:abstractNumId w:val="19"/>
-  </w:num>
-  <w:num w:numId="22" w16cid:durableId="694234799">
-    <w:abstractNumId w:val="14"/>
-  </w:num>
-  <w:num w:numId="23" w16cid:durableId="1086538186">
-    <w:abstractNumId w:val="4"/>
-  </w:num>
-  <w:num w:numId="24" w16cid:durableId="2007707210">
-    <w:abstractNumId w:val="2"/>
-  </w:num>
-  <w:num w:numId="25" w16cid:durableId="1269629032">
-    <w:abstractNumId w:val="13"/>
-  </w:num>
-  <w:num w:numId="26" w16cid:durableId="306127869">
-    <w:abstractNumId w:val="7"/>
+  <w:num w:numId="29" w16cid:durableId="2054380835">
+    <w:abstractNumId w:val="17"/>
   </w:num>
 </w:numbering>
 </file>
@@ -5708,7 +6209,7 @@
     <w:lsdException w:name="E-mail Signature" w:semiHidden="1" w:unhideWhenUsed="1"/>
     <w:lsdException w:name="HTML Top of Form" w:semiHidden="1" w:unhideWhenUsed="1"/>
     <w:lsdException w:name="HTML Bottom of Form" w:semiHidden="1" w:unhideWhenUsed="1"/>
-    <w:lsdException w:name="Normal (Web)" w:semiHidden="1" w:unhideWhenUsed="1"/>
+    <w:lsdException w:name="Normal (Web)" w:semiHidden="1" w:uiPriority="99" w:unhideWhenUsed="1"/>
     <w:lsdException w:name="HTML Acronym" w:semiHidden="1" w:unhideWhenUsed="1"/>
     <w:lsdException w:name="HTML Address" w:semiHidden="1" w:unhideWhenUsed="1"/>
     <w:lsdException w:name="HTML Cite" w:semiHidden="1" w:unhideWhenUsed="1"/>
@@ -6504,6 +7005,21 @@
       <w:szCs w:val="28"/>
     </w:rPr>
   </w:style>
+  <w:style w:type="paragraph" w:styleId="NormalWeb">
+    <w:name w:val="Normal (Web)"/>
+    <w:basedOn w:val="Normal"/>
+    <w:uiPriority w:val="99"/>
+    <w:semiHidden/>
+    <w:unhideWhenUsed/>
+    <w:rsid w:val="001E24B2"/>
+    <w:pPr>
+      <w:spacing w:before="100" w:beforeAutospacing="1" w:after="100" w:afterAutospacing="1"/>
+    </w:pPr>
+    <w:rPr>
+      <w:rFonts w:ascii="Times New Roman" w:hAnsi="Times New Roman"/>
+      <w:sz w:val="24"/>
+    </w:rPr>
+  </w:style>
 </w:styles>
 </file>
 
@@ -7398,7 +7914,7 @@
         </a:p>
       </dgm:t>
     </dgm:pt>
-    <dgm:pt modelId="{D52B4EB8-1970-4594-A0D9-8078202BF861}">
+    <dgm:pt modelId="{D8A41023-4A28-4BCF-B37A-1D27EE4A4874}">
       <dgm:prSet phldrT="[Texto]" custT="1"/>
       <dgm:spPr/>
       <dgm:t>
@@ -7406,11 +7922,14 @@
         <a:lstStyle/>
         <a:p>
           <a:pPr algn="ctr"/>
-          <a:endParaRPr lang="pt-BR" sz="900"/>
+          <a:r>
+            <a:rPr lang="pt-BR" sz="900"/>
+            <a:t>2.2 Desenvolvimento de códigos para placas (ESP32) </a:t>
+          </a:r>
         </a:p>
       </dgm:t>
     </dgm:pt>
-    <dgm:pt modelId="{06DE54F6-2037-4C74-93CE-668476683796}" type="parTrans" cxnId="{722FDEE4-9736-439D-BC82-EF06A21F6AE3}">
+    <dgm:pt modelId="{7A569D9B-250A-4101-B6D8-FEAFE218C119}" type="parTrans" cxnId="{289AE94E-B7E0-46A6-A742-43BA0CF9FE06}">
       <dgm:prSet/>
       <dgm:spPr/>
       <dgm:t>
@@ -7422,7 +7941,7 @@
         </a:p>
       </dgm:t>
     </dgm:pt>
-    <dgm:pt modelId="{CFDF4C0F-F9BC-4376-A717-6D3EFE6D3E3A}" type="sibTrans" cxnId="{722FDEE4-9736-439D-BC82-EF06A21F6AE3}">
+    <dgm:pt modelId="{E59E5E14-59CB-4C81-9271-B0A64A0884EA}" type="sibTrans" cxnId="{289AE94E-B7E0-46A6-A742-43BA0CF9FE06}">
       <dgm:prSet/>
       <dgm:spPr/>
       <dgm:t>
@@ -7434,7 +7953,7 @@
         </a:p>
       </dgm:t>
     </dgm:pt>
-    <dgm:pt modelId="{D8A41023-4A28-4BCF-B37A-1D27EE4A4874}">
+    <dgm:pt modelId="{32817D72-D306-49D7-960F-7CC718CDCB8A}">
       <dgm:prSet phldrT="[Texto]" custT="1"/>
       <dgm:spPr/>
       <dgm:t>
@@ -7442,11 +7961,14 @@
         <a:lstStyle/>
         <a:p>
           <a:pPr algn="ctr"/>
-          <a:endParaRPr lang="pt-BR" sz="900"/>
+          <a:r>
+            <a:rPr lang="pt-BR" sz="900"/>
+            <a:t>2.3 Seleção, configuração e processos de segurança da informação em dispositivos de rede</a:t>
+          </a:r>
         </a:p>
       </dgm:t>
     </dgm:pt>
-    <dgm:pt modelId="{7A569D9B-250A-4101-B6D8-FEAFE218C119}" type="parTrans" cxnId="{289AE94E-B7E0-46A6-A742-43BA0CF9FE06}">
+    <dgm:pt modelId="{8CA65AA8-1DAA-428E-9B90-240B2C39A484}" type="parTrans" cxnId="{3797E059-3A52-4E79-AE7B-91CDB3F02852}">
       <dgm:prSet/>
       <dgm:spPr/>
       <dgm:t>
@@ -7458,7 +7980,7 @@
         </a:p>
       </dgm:t>
     </dgm:pt>
-    <dgm:pt modelId="{E59E5E14-59CB-4C81-9271-B0A64A0884EA}" type="sibTrans" cxnId="{289AE94E-B7E0-46A6-A742-43BA0CF9FE06}">
+    <dgm:pt modelId="{D866A751-2D15-4ACB-8DDA-4916282588E1}" type="sibTrans" cxnId="{3797E059-3A52-4E79-AE7B-91CDB3F02852}">
       <dgm:prSet/>
       <dgm:spPr/>
       <dgm:t>
@@ -7470,19 +7992,22 @@
         </a:p>
       </dgm:t>
     </dgm:pt>
-    <dgm:pt modelId="{32817D72-D306-49D7-960F-7CC718CDCB8A}">
-      <dgm:prSet phldrT="[Texto]" custT="1"/>
+    <dgm:pt modelId="{9DB4BCDE-0A70-4D85-BB00-B19D39372666}">
+      <dgm:prSet custT="1"/>
       <dgm:spPr/>
       <dgm:t>
         <a:bodyPr/>
         <a:lstStyle/>
         <a:p>
           <a:pPr algn="ctr"/>
-          <a:endParaRPr lang="pt-BR" sz="900"/>
+          <a:r>
+            <a:rPr lang="pt-BR" sz="900"/>
+            <a:t>1.2 Levantamento de requisitos de negócio</a:t>
+          </a:r>
         </a:p>
       </dgm:t>
     </dgm:pt>
-    <dgm:pt modelId="{8CA65AA8-1DAA-428E-9B90-240B2C39A484}" type="parTrans" cxnId="{3797E059-3A52-4E79-AE7B-91CDB3F02852}">
+    <dgm:pt modelId="{E7BF3264-0E6A-45F9-AFC3-2A5970760737}" type="parTrans" cxnId="{CF6A76FA-824F-4A5E-99A6-0A87F68449E4}">
       <dgm:prSet/>
       <dgm:spPr/>
       <dgm:t>
@@ -7494,7 +8019,7 @@
         </a:p>
       </dgm:t>
     </dgm:pt>
-    <dgm:pt modelId="{D866A751-2D15-4ACB-8DDA-4916282588E1}" type="sibTrans" cxnId="{3797E059-3A52-4E79-AE7B-91CDB3F02852}">
+    <dgm:pt modelId="{670F1897-20BD-4A96-9CDE-2B0A0C18F0D0}" type="sibTrans" cxnId="{CF6A76FA-824F-4A5E-99A6-0A87F68449E4}">
       <dgm:prSet/>
       <dgm:spPr/>
       <dgm:t>
@@ -7506,7 +8031,7 @@
         </a:p>
       </dgm:t>
     </dgm:pt>
-    <dgm:pt modelId="{9DB4BCDE-0A70-4D85-BB00-B19D39372666}">
+    <dgm:pt modelId="{CDA01CDF-5181-4924-9D13-802C86443EB5}">
       <dgm:prSet custT="1"/>
       <dgm:spPr/>
       <dgm:t>
@@ -7514,11 +8039,14 @@
         <a:lstStyle/>
         <a:p>
           <a:pPr algn="ctr"/>
-          <a:endParaRPr lang="pt-BR" sz="900"/>
+          <a:r>
+            <a:rPr lang="pt-BR" sz="900"/>
+            <a:t>1.3 Levantamento de requisitos técnicos</a:t>
+          </a:r>
         </a:p>
       </dgm:t>
     </dgm:pt>
-    <dgm:pt modelId="{E7BF3264-0E6A-45F9-AFC3-2A5970760737}" type="parTrans" cxnId="{CF6A76FA-824F-4A5E-99A6-0A87F68449E4}">
+    <dgm:pt modelId="{83C472DC-37AA-4C2C-A4F9-C2C5BE0485F5}" type="parTrans" cxnId="{CE8D5A07-595E-45FE-A3D0-CEBD20361514}">
       <dgm:prSet/>
       <dgm:spPr/>
       <dgm:t>
@@ -7530,7 +8058,7 @@
         </a:p>
       </dgm:t>
     </dgm:pt>
-    <dgm:pt modelId="{670F1897-20BD-4A96-9CDE-2B0A0C18F0D0}" type="sibTrans" cxnId="{CF6A76FA-824F-4A5E-99A6-0A87F68449E4}">
+    <dgm:pt modelId="{A1C9D5CC-ABB0-48A7-BF07-6B455F7A2F4B}" type="sibTrans" cxnId="{CE8D5A07-595E-45FE-A3D0-CEBD20361514}">
       <dgm:prSet/>
       <dgm:spPr/>
       <dgm:t>
@@ -7542,7 +8070,7 @@
         </a:p>
       </dgm:t>
     </dgm:pt>
-    <dgm:pt modelId="{CDA01CDF-5181-4924-9D13-802C86443EB5}">
+    <dgm:pt modelId="{D86D623A-7518-48C3-9C16-A7EDE5451FDC}">
       <dgm:prSet custT="1"/>
       <dgm:spPr/>
       <dgm:t>
@@ -7550,43 +8078,10 @@
         <a:lstStyle/>
         <a:p>
           <a:pPr algn="ctr"/>
-          <a:endParaRPr lang="pt-BR" sz="900"/>
-        </a:p>
-      </dgm:t>
-    </dgm:pt>
-    <dgm:pt modelId="{83C472DC-37AA-4C2C-A4F9-C2C5BE0485F5}" type="parTrans" cxnId="{CE8D5A07-595E-45FE-A3D0-CEBD20361514}">
-      <dgm:prSet/>
-      <dgm:spPr/>
-      <dgm:t>
-        <a:bodyPr/>
-        <a:lstStyle/>
-        <a:p>
-          <a:pPr algn="ctr"/>
-          <a:endParaRPr lang="pt-BR" sz="2800"/>
-        </a:p>
-      </dgm:t>
-    </dgm:pt>
-    <dgm:pt modelId="{A1C9D5CC-ABB0-48A7-BF07-6B455F7A2F4B}" type="sibTrans" cxnId="{CE8D5A07-595E-45FE-A3D0-CEBD20361514}">
-      <dgm:prSet/>
-      <dgm:spPr/>
-      <dgm:t>
-        <a:bodyPr/>
-        <a:lstStyle/>
-        <a:p>
-          <a:pPr algn="ctr"/>
-          <a:endParaRPr lang="pt-BR" sz="2800"/>
-        </a:p>
-      </dgm:t>
-    </dgm:pt>
-    <dgm:pt modelId="{D86D623A-7518-48C3-9C16-A7EDE5451FDC}">
-      <dgm:prSet custT="1"/>
-      <dgm:spPr/>
-      <dgm:t>
-        <a:bodyPr/>
-        <a:lstStyle/>
-        <a:p>
-          <a:pPr algn="ctr"/>
-          <a:endParaRPr lang="pt-BR" sz="900"/>
+          <a:r>
+            <a:rPr lang="pt-BR" sz="900"/>
+            <a:t>2.4 Desenvolvimento de códigos para  tratamento e visualização de dados</a:t>
+          </a:r>
         </a:p>
       </dgm:t>
     </dgm:pt>
@@ -7665,7 +8160,10 @@
         <a:lstStyle/>
         <a:p>
           <a:pPr algn="ctr"/>
-          <a:endParaRPr lang="pt-BR" sz="900"/>
+          <a:r>
+            <a:rPr lang="pt-BR" sz="900"/>
+            <a:t>3.1 Testes de funcionalidades de acordo com os requisitos de negócio</a:t>
+          </a:r>
         </a:p>
       </dgm:t>
     </dgm:pt>
@@ -7701,7 +8199,10 @@
         <a:lstStyle/>
         <a:p>
           <a:pPr algn="ctr"/>
-          <a:endParaRPr lang="pt-BR" sz="900"/>
+          <a:r>
+            <a:rPr lang="pt-BR" sz="900"/>
+            <a:t>3.2 Documentação de testes e validações com usuários</a:t>
+          </a:r>
         </a:p>
       </dgm:t>
     </dgm:pt>
@@ -7737,7 +8238,10 @@
         <a:lstStyle/>
         <a:p>
           <a:pPr algn="ctr"/>
-          <a:endParaRPr lang="pt-BR" sz="900"/>
+          <a:r>
+            <a:rPr lang="pt-BR" sz="900"/>
+            <a:t>2.1 Aquisição e instalação de componentes eletrônicos.</a:t>
+          </a:r>
         </a:p>
       </dgm:t>
     </dgm:pt>
@@ -7773,7 +8277,10 @@
         <a:lstStyle/>
         <a:p>
           <a:pPr algn="ctr"/>
-          <a:endParaRPr lang="pt-BR" sz="900"/>
+          <a:r>
+            <a:rPr lang="pt-BR" sz="900"/>
+            <a:t>3.3 Documentação de desenvolvimentos</a:t>
+          </a:r>
         </a:p>
       </dgm:t>
     </dgm:pt>
@@ -7807,7 +8314,10 @@
         <a:lstStyle/>
         <a:p>
           <a:pPr algn="ctr"/>
-          <a:endParaRPr lang="pt-BR" sz="900"/>
+          <a:r>
+            <a:rPr lang="pt-BR" sz="900"/>
+            <a:t>3.4 Apresentações e treinamentos</a:t>
+          </a:r>
         </a:p>
       </dgm:t>
     </dgm:pt>
@@ -7841,7 +8351,10 @@
         <a:lstStyle/>
         <a:p>
           <a:pPr algn="ctr"/>
-          <a:endParaRPr lang="pt-BR" sz="900"/>
+          <a:r>
+            <a:rPr lang="pt-BR" sz="900"/>
+            <a:t>1.4 Simulação de situação problema </a:t>
+          </a:r>
         </a:p>
       </dgm:t>
     </dgm:pt>
@@ -7864,6 +8377,45 @@
         <a:lstStyle/>
         <a:p>
           <a:endParaRPr lang="pt-BR"/>
+        </a:p>
+      </dgm:t>
+    </dgm:pt>
+    <dgm:pt modelId="{D52B4EB8-1970-4594-A0D9-8078202BF861}">
+      <dgm:prSet phldrT="[Texto]" custT="1"/>
+      <dgm:spPr/>
+      <dgm:t>
+        <a:bodyPr/>
+        <a:lstStyle/>
+        <a:p>
+          <a:pPr algn="ctr"/>
+          <a:r>
+            <a:rPr lang="pt-BR" sz="900"/>
+            <a:t>1.1 Identificação de necessidades e oportunidades</a:t>
+          </a:r>
+        </a:p>
+      </dgm:t>
+    </dgm:pt>
+    <dgm:pt modelId="{CFDF4C0F-F9BC-4376-A717-6D3EFE6D3E3A}" type="sibTrans" cxnId="{722FDEE4-9736-439D-BC82-EF06A21F6AE3}">
+      <dgm:prSet/>
+      <dgm:spPr/>
+      <dgm:t>
+        <a:bodyPr/>
+        <a:lstStyle/>
+        <a:p>
+          <a:pPr algn="ctr"/>
+          <a:endParaRPr lang="pt-BR" sz="2800"/>
+        </a:p>
+      </dgm:t>
+    </dgm:pt>
+    <dgm:pt modelId="{06DE54F6-2037-4C74-93CE-668476683796}" type="parTrans" cxnId="{722FDEE4-9736-439D-BC82-EF06A21F6AE3}">
+      <dgm:prSet/>
+      <dgm:spPr/>
+      <dgm:t>
+        <a:bodyPr/>
+        <a:lstStyle/>
+        <a:p>
+          <a:pPr algn="ctr"/>
+          <a:endParaRPr lang="pt-BR" sz="2800"/>
         </a:p>
       </dgm:t>
     </dgm:pt>
@@ -9738,7 +10290,10 @@
             </a:spcAft>
             <a:buNone/>
           </a:pPr>
-          <a:endParaRPr lang="pt-BR" sz="900" kern="1200"/>
+          <a:r>
+            <a:rPr lang="pt-BR" sz="900" kern="1200"/>
+            <a:t>1.1 Identificação de necessidades e oportunidades</a:t>
+          </a:r>
         </a:p>
       </dsp:txBody>
       <dsp:txXfrm>
@@ -9812,7 +10367,10 @@
             </a:spcAft>
             <a:buNone/>
           </a:pPr>
-          <a:endParaRPr lang="pt-BR" sz="900" kern="1200"/>
+          <a:r>
+            <a:rPr lang="pt-BR" sz="900" kern="1200"/>
+            <a:t>1.2 Levantamento de requisitos de negócio</a:t>
+          </a:r>
         </a:p>
       </dsp:txBody>
       <dsp:txXfrm>
@@ -9886,7 +10444,10 @@
             </a:spcAft>
             <a:buNone/>
           </a:pPr>
-          <a:endParaRPr lang="pt-BR" sz="900" kern="1200"/>
+          <a:r>
+            <a:rPr lang="pt-BR" sz="900" kern="1200"/>
+            <a:t>1.3 Levantamento de requisitos técnicos</a:t>
+          </a:r>
         </a:p>
       </dsp:txBody>
       <dsp:txXfrm>
@@ -9960,7 +10521,10 @@
             </a:spcAft>
             <a:buNone/>
           </a:pPr>
-          <a:endParaRPr lang="pt-BR" sz="900" kern="1200"/>
+          <a:r>
+            <a:rPr lang="pt-BR" sz="900" kern="1200"/>
+            <a:t>1.4 Simulação de situação problema </a:t>
+          </a:r>
         </a:p>
       </dsp:txBody>
       <dsp:txXfrm>
@@ -10106,7 +10670,10 @@
             </a:spcAft>
             <a:buNone/>
           </a:pPr>
-          <a:endParaRPr lang="pt-BR" sz="900" kern="1200"/>
+          <a:r>
+            <a:rPr lang="pt-BR" sz="900" kern="1200"/>
+            <a:t>2.1 Aquisição e instalação de componentes eletrônicos.</a:t>
+          </a:r>
         </a:p>
       </dsp:txBody>
       <dsp:txXfrm>
@@ -10180,7 +10747,10 @@
             </a:spcAft>
             <a:buNone/>
           </a:pPr>
-          <a:endParaRPr lang="pt-BR" sz="900" kern="1200"/>
+          <a:r>
+            <a:rPr lang="pt-BR" sz="900" kern="1200"/>
+            <a:t>2.2 Desenvolvimento de códigos para placas (ESP32) </a:t>
+          </a:r>
         </a:p>
       </dsp:txBody>
       <dsp:txXfrm>
@@ -10254,7 +10824,10 @@
             </a:spcAft>
             <a:buNone/>
           </a:pPr>
-          <a:endParaRPr lang="pt-BR" sz="900" kern="1200"/>
+          <a:r>
+            <a:rPr lang="pt-BR" sz="900" kern="1200"/>
+            <a:t>2.3 Seleção, configuração e processos de segurança da informação em dispositivos de rede</a:t>
+          </a:r>
         </a:p>
       </dsp:txBody>
       <dsp:txXfrm>
@@ -10328,7 +10901,10 @@
             </a:spcAft>
             <a:buNone/>
           </a:pPr>
-          <a:endParaRPr lang="pt-BR" sz="900" kern="1200"/>
+          <a:r>
+            <a:rPr lang="pt-BR" sz="900" kern="1200"/>
+            <a:t>2.4 Desenvolvimento de códigos para  tratamento e visualização de dados</a:t>
+          </a:r>
         </a:p>
       </dsp:txBody>
       <dsp:txXfrm>
@@ -10474,7 +11050,10 @@
             </a:spcAft>
             <a:buNone/>
           </a:pPr>
-          <a:endParaRPr lang="pt-BR" sz="900" kern="1200"/>
+          <a:r>
+            <a:rPr lang="pt-BR" sz="900" kern="1200"/>
+            <a:t>3.1 Testes de funcionalidades de acordo com os requisitos de negócio</a:t>
+          </a:r>
         </a:p>
       </dsp:txBody>
       <dsp:txXfrm>
@@ -10548,7 +11127,10 @@
             </a:spcAft>
             <a:buNone/>
           </a:pPr>
-          <a:endParaRPr lang="pt-BR" sz="900" kern="1200"/>
+          <a:r>
+            <a:rPr lang="pt-BR" sz="900" kern="1200"/>
+            <a:t>3.2 Documentação de testes e validações com usuários</a:t>
+          </a:r>
         </a:p>
       </dsp:txBody>
       <dsp:txXfrm>
@@ -10622,7 +11204,10 @@
             </a:spcAft>
             <a:buNone/>
           </a:pPr>
-          <a:endParaRPr lang="pt-BR" sz="900" kern="1200"/>
+          <a:r>
+            <a:rPr lang="pt-BR" sz="900" kern="1200"/>
+            <a:t>3.3 Documentação de desenvolvimentos</a:t>
+          </a:r>
         </a:p>
       </dsp:txBody>
       <dsp:txXfrm>
@@ -10696,7 +11281,10 @@
             </a:spcAft>
             <a:buNone/>
           </a:pPr>
-          <a:endParaRPr lang="pt-BR" sz="900" kern="1200"/>
+          <a:r>
+            <a:rPr lang="pt-BR" sz="900" kern="1200"/>
+            <a:t>3.4 Apresentações e treinamentos</a:t>
+          </a:r>
         </a:p>
       </dsp:txBody>
       <dsp:txXfrm>

</xml_diff>

<commit_message>
equipamento para instalação do sensor
</commit_message>
<xml_diff>
--- a/Atividade 26 -08-2025 Escopo de projeto - Antonio Jair.docx
+++ b/Atividade 26 -08-2025 Escopo de projeto - Antonio Jair.docx
@@ -236,6 +236,12 @@
                 <w:rFonts w:asciiTheme="minorHAnsi" w:hAnsiTheme="minorHAnsi"/>
               </w:rPr>
             </w:pPr>
+            <w:r>
+              <w:rPr>
+                <w:rFonts w:asciiTheme="minorHAnsi" w:hAnsiTheme="minorHAnsi"/>
+              </w:rPr>
+              <w:t>Jair e Giovani</w:t>
+            </w:r>
           </w:p>
         </w:tc>
       </w:tr>
@@ -2063,6 +2069,33 @@
     <w:p>
       <w:pPr>
         <w:pStyle w:val="PargrafodaLista"/>
+        <w:jc w:val="both"/>
+      </w:pPr>
+      <w:r>
+        <w:t>- um resistor de 1K</w:t>
+      </w:r>
+      <w:r>
+        <w:rPr>
+          <w:rFonts w:cs="Calibri"/>
+        </w:rPr>
+        <w:t>Ω</w:t>
+      </w:r>
+      <w:r>
+        <w:t>.</w:t>
+      </w:r>
+    </w:p>
+    <w:p>
+      <w:pPr>
+        <w:pStyle w:val="PargrafodaLista"/>
+        <w:jc w:val="both"/>
+      </w:pPr>
+      <w:r>
+        <w:t>- uma fonte de alimentação  de 6v a 36v.</w:t>
+      </w:r>
+    </w:p>
+    <w:p>
+      <w:pPr>
+        <w:pStyle w:val="PargrafodaLista"/>
         <w:ind w:left="1080"/>
         <w:jc w:val="both"/>
       </w:pPr>
@@ -2134,7 +2167,6 @@
         <w:jc w:val="both"/>
       </w:pPr>
       <w:r>
-        <w:lastRenderedPageBreak/>
         <w:t>Visualização: Criação de dashboard no Node-RED ou Grafana com histórico, gráficos e indicadores.</w:t>
       </w:r>
     </w:p>

</xml_diff>